<commit_message>
Add charter communication evidence
</commit_message>
<xml_diff>
--- a/assets/agile-team-charter/agile_team_charter.docx
+++ b/assets/agile-team-charter/agile_team_charter.docx
@@ -249,16 +249,8 @@
             </w:tcMar>
           </w:tcPr>
           <w:p>
-            <w:pPr>
-              <w:spacing w:after="0"/>
-            </w:pPr>
             <w:r>
-              <w:rPr>
-                <w:rFonts w:ascii="Aptos" w:hAnsi="Aptos"/>
-                <w:b/>
-                <w:sz w:val="18"/>
-              </w:rPr>
-              <w:t>Sinazo</w:t>
+              <w:t>Sinazo Ntsimbi</w:t>
             </w:r>
           </w:p>
         </w:tc>
@@ -274,15 +266,8 @@
             </w:tcMar>
           </w:tcPr>
           <w:p>
-            <w:pPr>
-              <w:spacing w:after="0"/>
-            </w:pPr>
             <w:r>
-              <w:rPr>
-                <w:rFonts w:ascii="Aptos" w:hAnsi="Aptos"/>
-                <w:sz w:val="18"/>
-              </w:rPr>
-              <w:t>Team member. Contributes to planning, research and validation, assigned Trello tasks, team discussions, reviews and presentations.</w:t>
+              <w:t>Team member. Contributes to product-backlog coordination, planning, research and validation, assigned Trello tasks, team discussions, reviews and presentations.</w:t>
             </w:r>
           </w:p>
         </w:tc>
@@ -304,16 +289,8 @@
             <w:shd w:fill="F2F4F5"/>
           </w:tcPr>
           <w:p>
-            <w:pPr>
-              <w:spacing w:after="0"/>
-            </w:pPr>
             <w:r>
-              <w:rPr>
-                <w:rFonts w:ascii="Aptos" w:hAnsi="Aptos"/>
-                <w:b/>
-                <w:sz w:val="18"/>
-              </w:rPr>
-              <w:t>Sanda</w:t>
+              <w:t>Sibulele Sanda Pama</w:t>
             </w:r>
           </w:p>
         </w:tc>
@@ -330,15 +307,8 @@
             <w:shd w:fill="F2F4F5"/>
           </w:tcPr>
           <w:p>
-            <w:pPr>
-              <w:spacing w:after="0"/>
-            </w:pPr>
             <w:r>
-              <w:rPr>
-                <w:rFonts w:ascii="Aptos" w:hAnsi="Aptos"/>
-                <w:sz w:val="18"/>
-              </w:rPr>
-              <w:t>Team member. Contributes to planning, process and service development, assigned Trello tasks, team discussions, reviews and presentations.</w:t>
+              <w:t>Team member. Contributes to planning, website development, assigned Trello tasks, team discussions, reviews and presentations.</w:t>
             </w:r>
           </w:p>
         </w:tc>
@@ -2306,15 +2276,8 @@
             </w:tcMar>
           </w:tcPr>
           <w:p>
-            <w:pPr>
-              <w:spacing w:after="0"/>
-            </w:pPr>
             <w:r>
-              <w:rPr>
-                <w:rFonts w:ascii="Aptos" w:hAnsi="Aptos"/>
-                <w:sz w:val="18"/>
-              </w:rPr>
-              <w:t>Sinazo</w:t>
+              <w:t>Sinazo Ntsimbi</w:t>
             </w:r>
           </w:p>
         </w:tc>
@@ -2330,16 +2293,8 @@
             </w:tcMar>
           </w:tcPr>
           <w:p>
-            <w:pPr>
-              <w:spacing w:after="0"/>
-            </w:pPr>
             <w:r>
-              <w:rPr>
-                <w:rFonts w:ascii="Aptos" w:hAnsi="Aptos"/>
-                <w:b/>
-                <w:sz w:val="18"/>
-              </w:rPr>
-              <w:t>S</w:t>
+              <w:t>SN</w:t>
             </w:r>
           </w:p>
         </w:tc>
@@ -2385,15 +2340,8 @@
             <w:shd w:fill="F2F4F5"/>
           </w:tcPr>
           <w:p>
-            <w:pPr>
-              <w:spacing w:after="0"/>
-            </w:pPr>
             <w:r>
-              <w:rPr>
-                <w:rFonts w:ascii="Aptos" w:hAnsi="Aptos"/>
-                <w:sz w:val="18"/>
-              </w:rPr>
-              <w:t>Sanda</w:t>
+              <w:t>Sibulele Sanda Pama</w:t>
             </w:r>
           </w:p>
         </w:tc>
@@ -2410,16 +2358,8 @@
             <w:shd w:fill="F2F4F5"/>
           </w:tcPr>
           <w:p>
-            <w:pPr>
-              <w:spacing w:after="0"/>
-            </w:pPr>
             <w:r>
-              <w:rPr>
-                <w:rFonts w:ascii="Aptos" w:hAnsi="Aptos"/>
-                <w:b/>
-                <w:sz w:val="18"/>
-              </w:rPr>
-              <w:t>S</w:t>
+              <w:t>SP</w:t>
             </w:r>
           </w:p>
         </w:tc>
@@ -2631,12 +2571,234 @@
         <w:pStyle w:val="ListBullet"/>
       </w:pPr>
       <w:r>
+        <w:t>The Outlook communication screenshots document product-backlog preparation, Trello updates, Figma review, website planning and GitHub collaboration involving all three team members.</w:t>
+      </w:r>
+    </w:p>
+    <w:p>
+      <w:pPr>
+        <w:pStyle w:val="ListBullet"/>
+      </w:pPr>
+      <w:r>
         <w:t>WhatsApp and Outlook email were confirmed by the team as its primary communication channels.</w:t>
       </w:r>
     </w:p>
     <w:p>
       <w:r>
         <w:t>Supplier pricing, delivery costs and delivery arrangements remain assumptions until validated.</w:t>
+      </w:r>
+    </w:p>
+    <w:p>
+      <w:r>
+        <w:br w:type="page"/>
+      </w:r>
+    </w:p>
+    <w:p>
+      <w:pPr>
+        <w:pStyle w:val="Heading1"/>
+      </w:pPr>
+      <w:r>
+        <w:t>Appendix A: Communication and Collaboration Evidence</w:t>
+      </w:r>
+    </w:p>
+    <w:p>
+      <w:r>
+        <w:t>The following Outlook email records show the team applying its communication and collaboration agreements between July and August 2026.</w:t>
+      </w:r>
+    </w:p>
+    <w:p>
+      <w:pPr>
+        <w:pStyle w:val="Heading2"/>
+      </w:pPr>
+      <w:r>
+        <w:t>Product Backlog Preparation and Updates</w:t>
+      </w:r>
+    </w:p>
+    <w:p>
+      <w:pPr>
+        <w:jc w:val="center"/>
+      </w:pPr>
+      <w:r>
+        <w:drawing>
+          <wp:inline xmlns:a="http://schemas.openxmlformats.org/drawingml/2006/main" xmlns:pic="http://schemas.openxmlformats.org/drawingml/2006/picture">
+            <wp:extent cx="5943600" cy="4123522"/>
+            <wp:docPr id="1" name="Picture 1"/>
+            <wp:cNvGraphicFramePr>
+              <a:graphicFrameLocks noChangeAspect="1"/>
+            </wp:cNvGraphicFramePr>
+            <a:graphic>
+              <a:graphicData uri="http://schemas.openxmlformats.org/drawingml/2006/picture">
+                <pic:pic>
+                  <pic:nvPicPr>
+                    <pic:cNvPr id="0" name="outlook_product_backlog_messages.png"/>
+                    <pic:cNvPicPr/>
+                  </pic:nvPicPr>
+                  <pic:blipFill>
+                    <a:blip r:embed="rId15"/>
+                    <a:stretch>
+                      <a:fillRect/>
+                    </a:stretch>
+                  </pic:blipFill>
+                  <pic:spPr>
+                    <a:xfrm>
+                      <a:off x="0" y="0"/>
+                      <a:ext cx="5943600" cy="4123522"/>
+                    </a:xfrm>
+                    <a:prstGeom prst="rect"/>
+                  </pic:spPr>
+                </pic:pic>
+              </a:graphicData>
+            </a:graphic>
+          </wp:inline>
+        </w:drawing>
+      </w:r>
+    </w:p>
+    <w:p>
+      <w:pPr>
+        <w:spacing w:before="80"/>
+        <w:jc w:val="center"/>
+      </w:pPr>
+      <w:r>
+        <w:rPr>
+          <w:rFonts w:ascii="Aptos" w:hAnsi="Aptos"/>
+          <w:i/>
+          <w:color w:val="17324D"/>
+          <w:sz w:val="18"/>
+        </w:rPr>
+        <w:t>Outlook discussion between Sinazo Ntsimbi and Tiyani Ngwana about preparing and updating the Product Backlog, 22–23 July 2026.</w:t>
+      </w:r>
+    </w:p>
+    <w:p>
+      <w:r>
+        <w:br w:type="page"/>
+      </w:r>
+    </w:p>
+    <w:p>
+      <w:pPr>
+        <w:pStyle w:val="Heading2"/>
+      </w:pPr>
+      <w:r>
+        <w:t>Trello and Figma Review</w:t>
+      </w:r>
+    </w:p>
+    <w:p>
+      <w:pPr>
+        <w:jc w:val="center"/>
+      </w:pPr>
+      <w:r>
+        <w:drawing>
+          <wp:inline xmlns:a="http://schemas.openxmlformats.org/drawingml/2006/main" xmlns:pic="http://schemas.openxmlformats.org/drawingml/2006/picture">
+            <wp:extent cx="5943600" cy="3934496"/>
+            <wp:docPr id="2" name="Picture 2"/>
+            <wp:cNvGraphicFramePr>
+              <a:graphicFrameLocks noChangeAspect="1"/>
+            </wp:cNvGraphicFramePr>
+            <a:graphic>
+              <a:graphicData uri="http://schemas.openxmlformats.org/drawingml/2006/picture">
+                <pic:pic>
+                  <pic:nvPicPr>
+                    <pic:cNvPr id="0" name="outlook_trello_figma_updates.png"/>
+                    <pic:cNvPicPr/>
+                  </pic:nvPicPr>
+                  <pic:blipFill>
+                    <a:blip r:embed="rId16"/>
+                    <a:stretch>
+                      <a:fillRect/>
+                    </a:stretch>
+                  </pic:blipFill>
+                  <pic:spPr>
+                    <a:xfrm>
+                      <a:off x="0" y="0"/>
+                      <a:ext cx="5943600" cy="3934496"/>
+                    </a:xfrm>
+                    <a:prstGeom prst="rect"/>
+                  </pic:spPr>
+                </pic:pic>
+              </a:graphicData>
+            </a:graphic>
+          </wp:inline>
+        </w:drawing>
+      </w:r>
+    </w:p>
+    <w:p>
+      <w:pPr>
+        <w:spacing w:before="80"/>
+        <w:jc w:val="center"/>
+      </w:pPr>
+      <w:r>
+        <w:rPr>
+          <w:rFonts w:ascii="Aptos" w:hAnsi="Aptos"/>
+          <w:i/>
+          <w:color w:val="17324D"/>
+          <w:sz w:val="18"/>
+        </w:rPr>
+        <w:t>Outlook updates and acknowledgements concerning the Trello backlogs and Figma design, 24–28 July 2026.</w:t>
+      </w:r>
+    </w:p>
+    <w:p>
+      <w:r>
+        <w:br w:type="page"/>
+      </w:r>
+    </w:p>
+    <w:p>
+      <w:pPr>
+        <w:pStyle w:val="Heading2"/>
+      </w:pPr>
+      <w:r>
+        <w:t>Website and GitHub Collaboration</w:t>
+      </w:r>
+    </w:p>
+    <w:p>
+      <w:pPr>
+        <w:jc w:val="center"/>
+      </w:pPr>
+      <w:r>
+        <w:drawing>
+          <wp:inline xmlns:a="http://schemas.openxmlformats.org/drawingml/2006/main" xmlns:pic="http://schemas.openxmlformats.org/drawingml/2006/picture">
+            <wp:extent cx="5943600" cy="3892428"/>
+            <wp:docPr id="3" name="Picture 3"/>
+            <wp:cNvGraphicFramePr>
+              <a:graphicFrameLocks noChangeAspect="1"/>
+            </wp:cNvGraphicFramePr>
+            <a:graphic>
+              <a:graphicData uri="http://schemas.openxmlformats.org/drawingml/2006/picture">
+                <pic:pic>
+                  <pic:nvPicPr>
+                    <pic:cNvPr id="0" name="outlook_github_collaboration.png"/>
+                    <pic:cNvPicPr/>
+                  </pic:nvPicPr>
+                  <pic:blipFill>
+                    <a:blip r:embed="rId17"/>
+                    <a:stretch>
+                      <a:fillRect/>
+                    </a:stretch>
+                  </pic:blipFill>
+                  <pic:spPr>
+                    <a:xfrm>
+                      <a:off x="0" y="0"/>
+                      <a:ext cx="5943600" cy="3892428"/>
+                    </a:xfrm>
+                    <a:prstGeom prst="rect"/>
+                  </pic:spPr>
+                </pic:pic>
+              </a:graphicData>
+            </a:graphic>
+          </wp:inline>
+        </w:drawing>
+      </w:r>
+    </w:p>
+    <w:p>
+      <w:pPr>
+        <w:spacing w:before="80"/>
+        <w:jc w:val="center"/>
+      </w:pPr>
+      <w:r>
+        <w:rPr>
+          <w:rFonts w:ascii="Aptos" w:hAnsi="Aptos"/>
+          <w:i/>
+          <w:color w:val="17324D"/>
+          <w:sz w:val="18"/>
+        </w:rPr>
+        <w:t>Outlook discussion between Sibulele Sanda Pama and Tiyani Ngwana about website work, repository sharing and contributor coordination, 3–10 August 2026.</w:t>
       </w:r>
     </w:p>
     <w:sectPr>

</xml_diff>

<commit_message>
Correct charter signature dates
</commit_message>
<xml_diff>
--- a/assets/agile-team-charter/agile_team_charter.docx
+++ b/assets/agile-team-charter/agile_team_charter.docx
@@ -2310,15 +2310,8 @@
             </w:tcMar>
           </w:tcPr>
           <w:p>
-            <w:pPr>
-              <w:spacing w:after="0"/>
-            </w:pPr>
             <w:r>
-              <w:rPr>
-                <w:rFonts w:ascii="Aptos" w:hAnsi="Aptos"/>
-                <w:sz w:val="18"/>
-              </w:rPr>
-              <w:t>24 October 2026</w:t>
+              <w:t>17 July 2026</w:t>
             </w:r>
           </w:p>
         </w:tc>
@@ -2376,15 +2369,8 @@
             <w:shd w:fill="F2F4F5"/>
           </w:tcPr>
           <w:p>
-            <w:pPr>
-              <w:spacing w:after="0"/>
-            </w:pPr>
             <w:r>
-              <w:rPr>
-                <w:rFonts w:ascii="Aptos" w:hAnsi="Aptos"/>
-                <w:sz w:val="18"/>
-              </w:rPr>
-              <w:t>24 October 2026</w:t>
+              <w:t>17 July 2026</w:t>
             </w:r>
           </w:p>
         </w:tc>
@@ -2454,15 +2440,8 @@
             </w:tcMar>
           </w:tcPr>
           <w:p>
-            <w:pPr>
-              <w:spacing w:after="0"/>
-            </w:pPr>
             <w:r>
-              <w:rPr>
-                <w:rFonts w:ascii="Aptos" w:hAnsi="Aptos"/>
-                <w:sz w:val="18"/>
-              </w:rPr>
-              <w:t>24 October 2026</w:t>
+              <w:t>17 July 2026</w:t>
             </w:r>
           </w:p>
         </w:tc>

</xml_diff>

<commit_message>
Polish agile charter evidence layout
</commit_message>
<xml_diff>
--- a/assets/agile-team-charter/agile_team_charter.docx
+++ b/assets/agile-team-charter/agile_team_charter.docx
@@ -2457,7 +2457,7 @@
         <w:pStyle w:val="Heading1"/>
       </w:pPr>
       <w:r>
-        <w:t>Evidence Alignment</w:t>
+        <w:t>12. Evidence Alignment</w:t>
       </w:r>
     </w:p>
     <w:p>
@@ -2599,7 +2599,7 @@
       <w:r>
         <w:drawing>
           <wp:inline xmlns:a="http://schemas.openxmlformats.org/drawingml/2006/main" xmlns:pic="http://schemas.openxmlformats.org/drawingml/2006/picture">
-            <wp:extent cx="5943600" cy="4123522"/>
+            <wp:extent cx="5029200" cy="3489134"/>
             <wp:docPr id="1" name="Picture 1"/>
             <wp:cNvGraphicFramePr>
               <a:graphicFrameLocks noChangeAspect="1"/>
@@ -2620,7 +2620,7 @@
                   <pic:spPr>
                     <a:xfrm>
                       <a:off x="0" y="0"/>
-                      <a:ext cx="5943600" cy="4123522"/>
+                      <a:ext cx="5029200" cy="3489134"/>
                     </a:xfrm>
                     <a:prstGeom prst="rect"/>
                   </pic:spPr>
@@ -2666,7 +2666,7 @@
       <w:r>
         <w:drawing>
           <wp:inline xmlns:a="http://schemas.openxmlformats.org/drawingml/2006/main" xmlns:pic="http://schemas.openxmlformats.org/drawingml/2006/picture">
-            <wp:extent cx="5943600" cy="3934496"/>
+            <wp:extent cx="5029200" cy="3329188"/>
             <wp:docPr id="2" name="Picture 2"/>
             <wp:cNvGraphicFramePr>
               <a:graphicFrameLocks noChangeAspect="1"/>
@@ -2687,7 +2687,7 @@
                   <pic:spPr>
                     <a:xfrm>
                       <a:off x="0" y="0"/>
-                      <a:ext cx="5943600" cy="3934496"/>
+                      <a:ext cx="5029200" cy="3329188"/>
                     </a:xfrm>
                     <a:prstGeom prst="rect"/>
                   </pic:spPr>
@@ -2733,7 +2733,7 @@
       <w:r>
         <w:drawing>
           <wp:inline xmlns:a="http://schemas.openxmlformats.org/drawingml/2006/main" xmlns:pic="http://schemas.openxmlformats.org/drawingml/2006/picture">
-            <wp:extent cx="5943600" cy="3892428"/>
+            <wp:extent cx="5029200" cy="3293592"/>
             <wp:docPr id="3" name="Picture 3"/>
             <wp:cNvGraphicFramePr>
               <a:graphicFrameLocks noChangeAspect="1"/>
@@ -2754,7 +2754,7 @@
                   <pic:spPr>
                     <a:xfrm>
                       <a:off x="0" y="0"/>
-                      <a:ext cx="5943600" cy="3892428"/>
+                      <a:ext cx="5029200" cy="3293592"/>
                     </a:xfrm>
                     <a:prstGeom prst="rect"/>
                   </pic:spPr>

</xml_diff>